<commit_message>
Refaz a minuta do processo 0803320-05.2025.8.18.0056 pela ROTA 6
Por critério do Juiz, a anotação "NÃO ASSINOU NESSE ATO" no RG, somada
à alegação de analfabetismo na inicial, comprova o analfabetismo. Os
termos de 2019 (assinatura própria) e de 2023 (nato digital) não têm
assinatura a rogo nem duas testemunhas: procedência com danos morais
(D5, sem D3); prejuízo não prescrito de R$ 1.962,00.

Co-Authored-By: Claude Opus 5.5 <noreply@anthropic.com>
Claude-Session: https://claude.ai/code/session_01XASs5sEg98T5oFEhBdDStS
</commit_message>
<xml_diff>
--- a/MINUTA - SENTENCA - 0803320-05.2025.8.18.0056.docx
+++ b/MINUTA - SENTENCA - 0803320-05.2025.8.18.0056.docx
@@ -469,7 +469,7 @@
           <w:color w:val="000000"/>
           <w:sz w:val="24"/>
         </w:rPr>
-        <w:t xml:space="preserve">Da perfectibilização do negócio jurídico</w:t>
+        <w:t xml:space="preserve">Comprovação de analfabetismo</w:t>
       </w:r>
     </w:p>
     <w:p>
@@ -485,7 +485,108 @@
           <w:color w:val="000000"/>
           <w:sz w:val="24"/>
         </w:rPr>
-        <w:t xml:space="preserve">A parte demandada apresentou nos autos os elementos que comprovam a contratação: contrato com assinatura – Ficha-Proposta de Abertura de Conta de Depósito (agência 5794, conta 6639-7) e Termo de Opção à Cesta de Serviços Bradesco Expresso, com opção pela “Cesta Bradesco Expresso 5” (mensalidade de R$ 25,20 na data da opção) e autorização de débito da tarifa em conta-corrente, ambos assinados de próprio punho pelo autor em 03/05/2019, em Flores do Piauí-PI, acompanhados de cópia de seu documento de identidade (Id. 95217223); e contratação via assinatura eletrônica – Termo de Opção à Cesta de Serviços nº 0252214080, de adesão ao “Pacote Padronizado I” (mensalidade de R$ 15,45 na data da adesão), com autorização de débito em conta-corrente, assinado eletronicamente pelo autor em 05/09/2023, em Canto do Buriti-PI, com código de autenticação (hash) (Id. 95217224).</w:t>
+        <w:t xml:space="preserve">A parte autora, segundo o que consta no documento de identidade (Id. 86986483), que traz a anotação “NÃO ASSINOU NESSE ATO”, e na procuração outorgada com assinatura a rogo (Id. 86986482), é analfabeta. Portanto, a contratação deveria ter observado os requisitos da lei civil. O sentido das súmulas do TJPI a seguir vão neste sentido:</w:t>
+      </w:r>
+    </w:p>
+    <w:p>
+      <w:pPr>
+        <w:spacing w:before="0" w:after="0" w:line="360" w:lineRule="auto"/>
+        <w:ind w:firstLine="0" w:left="0"/>
+        <w:jc w:val="left"/>
+      </w:pPr>
+    </w:p>
+    <w:p>
+      <w:pPr>
+        <w:spacing w:before="0" w:after="0" w:line="240" w:lineRule="auto"/>
+        <w:ind w:firstLine="0" w:left="2268"/>
+        <w:jc w:val="both"/>
+      </w:pPr>
+      <w:r>
+        <w:rPr>
+          <w:rFonts w:ascii="Times New Roman" w:hAnsi="Times New Roman"/>
+          <w:b w:val="0"/>
+          <w:color w:val="000000"/>
+          <w:sz w:val="20"/>
+        </w:rPr>
+        <w:t xml:space="preserve">TJPI | Súmula 30</w:t>
+      </w:r>
+    </w:p>
+    <w:p>
+      <w:pPr>
+        <w:spacing w:before="0" w:after="0" w:line="240" w:lineRule="auto"/>
+        <w:ind w:firstLine="0" w:left="2268"/>
+        <w:jc w:val="both"/>
+      </w:pPr>
+      <w:r>
+        <w:rPr>
+          <w:rFonts w:ascii="Times New Roman" w:hAnsi="Times New Roman"/>
+          <w:b w:val="0"/>
+          <w:color w:val="000000"/>
+          <w:sz w:val="20"/>
+        </w:rPr>
+        <w:t xml:space="preserve">A ausência de assinatura a rogo e subscrição por duas testemunhas nos instrumento de contrato de mútuo bancário atribuídos a pessoa analfabeta torna o negócio jurídico nulo, mesmo que seja comprovada a disponibilização do valor em conta de sua titularidade, configurando ato ilícito, gerando o dever de repará-lo, cabendo ao magistrado ou magistrada, no caso concreto, e de forma fundamentada, reconhecer categorias reparatórias devidas e fixar o respectivo quantum, sem prejuízo de eventual compensação.</w:t>
+      </w:r>
+    </w:p>
+    <w:p>
+      <w:pPr>
+        <w:spacing w:before="0" w:after="0" w:line="360" w:lineRule="auto"/>
+        <w:ind w:firstLine="0" w:left="0"/>
+        <w:jc w:val="left"/>
+      </w:pPr>
+    </w:p>
+    <w:p>
+      <w:pPr>
+        <w:spacing w:before="0" w:after="0" w:line="240" w:lineRule="auto"/>
+        <w:ind w:firstLine="0" w:left="2268"/>
+        <w:jc w:val="both"/>
+      </w:pPr>
+      <w:r>
+        <w:rPr>
+          <w:rFonts w:ascii="Times New Roman" w:hAnsi="Times New Roman"/>
+          <w:b w:val="0"/>
+          <w:color w:val="000000"/>
+          <w:sz w:val="20"/>
+        </w:rPr>
+        <w:t xml:space="preserve">TJPI | Súmula 37</w:t>
+      </w:r>
+    </w:p>
+    <w:p>
+      <w:pPr>
+        <w:spacing w:before="0" w:after="0" w:line="240" w:lineRule="auto"/>
+        <w:ind w:firstLine="0" w:left="2268"/>
+        <w:jc w:val="both"/>
+      </w:pPr>
+      <w:r>
+        <w:rPr>
+          <w:rFonts w:ascii="Times New Roman" w:hAnsi="Times New Roman"/>
+          <w:b w:val="0"/>
+          <w:color w:val="000000"/>
+          <w:sz w:val="20"/>
+        </w:rPr>
+        <w:t xml:space="preserve">Os contratos firmados com pessoas não alfabetizadas, inclusive os firmados na modalidade nato digital, devem cumprir os requisitos estabelecidos pelo artigo 595, do Código Civil.</w:t>
+      </w:r>
+    </w:p>
+    <w:p>
+      <w:pPr>
+        <w:spacing w:before="0" w:after="0" w:line="360" w:lineRule="auto"/>
+        <w:ind w:firstLine="0" w:left="0"/>
+        <w:jc w:val="left"/>
+      </w:pPr>
+    </w:p>
+    <w:p>
+      <w:pPr>
+        <w:spacing w:before="0" w:after="0" w:line="360" w:lineRule="auto"/>
+        <w:ind w:firstLine="0" w:left="0"/>
+        <w:jc w:val="left"/>
+      </w:pPr>
+      <w:r>
+        <w:rPr>
+          <w:rFonts w:ascii="Times New Roman" w:hAnsi="Times New Roman"/>
+          <w:b/>
+          <w:color w:val="000000"/>
+          <w:sz w:val="24"/>
+        </w:rPr>
+        <w:t xml:space="preserve">Ato ilícito</w:t>
       </w:r>
     </w:p>
     <w:p>
@@ -501,7 +602,46 @@
           <w:color w:val="000000"/>
           <w:sz w:val="24"/>
         </w:rPr>
-        <w:t xml:space="preserve">Sendo assim, mister é a aplicação do princípio pacta sunt servanda, assim conceituado por Flávio Tartuce:</w:t>
+        <w:t xml:space="preserve">A parte demandada, ao desviar-se do ordenamento jurídico brasileiro, que exige bilateralismo hígido nas relações negociais, cometeu ato ilícito. Portanto, deve a conduta ser tida como cobrança indevida, causadora de evidente dano material. Tal fato, nos termos do art. 42, Parágrafo único, do CDC, impõe a restituição em dobro do indébito, com correção monetária e juros legais.</w:t>
+      </w:r>
+    </w:p>
+    <w:p>
+      <w:pPr>
+        <w:spacing w:before="0" w:after="0" w:line="360" w:lineRule="auto"/>
+        <w:ind w:firstLine="0" w:left="0"/>
+        <w:jc w:val="left"/>
+      </w:pPr>
+    </w:p>
+    <w:p>
+      <w:pPr>
+        <w:spacing w:before="0" w:after="0" w:line="360" w:lineRule="auto"/>
+        <w:ind w:firstLine="0" w:left="0"/>
+        <w:jc w:val="left"/>
+      </w:pPr>
+      <w:r>
+        <w:rPr>
+          <w:rFonts w:ascii="Times New Roman" w:hAnsi="Times New Roman"/>
+          <w:b/>
+          <w:color w:val="000000"/>
+          <w:sz w:val="24"/>
+        </w:rPr>
+        <w:t xml:space="preserve">Danos morais</w:t>
+      </w:r>
+    </w:p>
+    <w:p>
+      <w:pPr>
+        <w:spacing w:before="0" w:after="0" w:line="360" w:lineRule="auto"/>
+        <w:ind w:firstLine="709" w:left="0"/>
+        <w:jc w:val="both"/>
+      </w:pPr>
+      <w:r>
+        <w:rPr>
+          <w:rFonts w:ascii="Times New Roman" w:hAnsi="Times New Roman"/>
+          <w:b w:val="0"/>
+          <w:color w:val="000000"/>
+          <w:sz w:val="24"/>
+        </w:rPr>
+        <w:t xml:space="preserve">A pessoa analfabeta é, por natureza, hipervulnerável no momento da formalização de contratos. Isso traz presunção ao dano moral, principalmente em se tratando de reflexo sobre verbas de caráter alimentar. Este, inclusive, é o entendimento do TJPI:</w:t>
       </w:r>
     </w:p>
     <w:p>
@@ -524,7 +664,199 @@
           <w:color w:val="000000"/>
           <w:sz w:val="20"/>
         </w:rPr>
-        <w:t xml:space="preserve">Decorrente do princípio da autonomia privada, a força obrigatória dos contratos prevê que tem força de lei o estipulado pelas partes na avença, constrangendo os contratantes ao cumprimento do conteúdo completo do negócio jurídico. Esse princípio importa em autêntica restrição da liberdade, que se tornou limitada para aqueles que contrataram a partir do momento em que vieram a formar o contrato consensualmente e dotados de vontade autônoma. (TARTUCE, Flávio. Direito Civil - Vol.3 - 21ª Edição 2026. 21. ed. Rio de Janeiro: Forense, 2026. E-book. p. 104)</w:t>
+        <w:t xml:space="preserve">Ementa: DIREITO CIVIL E PROCESSUAL CIVIL. AGRAVO INTERNO. EMPRÉSTIMO CONSIGNADO. CONTRATO NULO. CONSUMIDOR ANALFABETO. AUSÊNCIA DE ASSINATURA A ROGO. DESCONTOS INDEVIDOS EM BENEFÍCIO PREVIDENCIÁRIO. RELAÇÃO DE TRATO SUCESSIVO. PRESCRIÇÃO QUINQUENAL PARCIAL. DANO MORAL IN RE IPSA. QUANTUM INDENIZATÓRIO. MANUTENÇÃO DA DECISÃO AGRAVADA. RECURSO DESPROVIDO.</w:t>
+      </w:r>
+    </w:p>
+    <w:p>
+      <w:pPr>
+        <w:spacing w:before="0" w:after="0" w:line="240" w:lineRule="auto"/>
+        <w:ind w:firstLine="0" w:left="2268"/>
+        <w:jc w:val="both"/>
+      </w:pPr>
+      <w:r>
+        <w:rPr>
+          <w:rFonts w:ascii="Times New Roman" w:hAnsi="Times New Roman"/>
+          <w:b w:val="0"/>
+          <w:color w:val="000000"/>
+          <w:sz w:val="20"/>
+        </w:rPr>
+        <w:t xml:space="preserve">I. CASO EM EXAME</w:t>
+      </w:r>
+    </w:p>
+    <w:p>
+      <w:pPr>
+        <w:spacing w:before="0" w:after="0" w:line="240" w:lineRule="auto"/>
+        <w:ind w:firstLine="0" w:left="2268"/>
+        <w:jc w:val="both"/>
+      </w:pPr>
+      <w:r>
+        <w:rPr>
+          <w:rFonts w:ascii="Times New Roman" w:hAnsi="Times New Roman"/>
+          <w:b w:val="0"/>
+          <w:color w:val="000000"/>
+          <w:sz w:val="20"/>
+        </w:rPr>
+        <w:t xml:space="preserve">Agravo Interno interposto contra decisão monocrática que deu parcial provimento às Apelações Cíveis, mantendo a nulidade de contrato de empréstimo consignado firmado por consumidor analfabeto sem observância da assinatura a rogo, reconhecendo a prescrição parcial das parcelas anteriores ao quinquênio legal, adequando a restituição do indébito aos parâmetros do Superior Tribunal de Justiça e majorando a indenização por danos morais para R$ 2.000,00. A agravante sustenta a inaplicabilidade da prescrição parcial em relação de trato sucessivo e requer a majoração do quantum indenizatório.</w:t>
+      </w:r>
+    </w:p>
+    <w:p>
+      <w:pPr>
+        <w:spacing w:before="0" w:after="0" w:line="240" w:lineRule="auto"/>
+        <w:ind w:firstLine="0" w:left="2268"/>
+        <w:jc w:val="both"/>
+      </w:pPr>
+      <w:r>
+        <w:rPr>
+          <w:rFonts w:ascii="Times New Roman" w:hAnsi="Times New Roman"/>
+          <w:b w:val="0"/>
+          <w:color w:val="000000"/>
+          <w:sz w:val="20"/>
+        </w:rPr>
+        <w:t xml:space="preserve">II. QUESTÃO EM DISCUSSÃO</w:t>
+      </w:r>
+    </w:p>
+    <w:p>
+      <w:pPr>
+        <w:spacing w:before="0" w:after="0" w:line="240" w:lineRule="auto"/>
+        <w:ind w:firstLine="0" w:left="2268"/>
+        <w:jc w:val="both"/>
+      </w:pPr>
+      <w:r>
+        <w:rPr>
+          <w:rFonts w:ascii="Times New Roman" w:hAnsi="Times New Roman"/>
+          <w:b w:val="0"/>
+          <w:color w:val="000000"/>
+          <w:sz w:val="20"/>
+        </w:rPr>
+        <w:t xml:space="preserve">Há duas questões em discussão: (i) definir se, em descontos indevidos decorrentes de contrato de empréstimo consignado nulo incidentes sobre benefício previdenciário, a prescrição quinquenal alcança apenas as parcelas anteriores aos cinco anos do ajuizamento da ação; e (ii) estabelecer se o valor fixado a título de danos morais revela-se insuficiente diante das circunstâncias do caso concreto.</w:t>
+      </w:r>
+    </w:p>
+    <w:p>
+      <w:pPr>
+        <w:spacing w:before="0" w:after="0" w:line="240" w:lineRule="auto"/>
+        <w:ind w:firstLine="0" w:left="2268"/>
+        <w:jc w:val="both"/>
+      </w:pPr>
+      <w:r>
+        <w:rPr>
+          <w:rFonts w:ascii="Times New Roman" w:hAnsi="Times New Roman"/>
+          <w:b w:val="0"/>
+          <w:color w:val="000000"/>
+          <w:sz w:val="20"/>
+        </w:rPr>
+        <w:t xml:space="preserve">III. RAZÕES DE DECIDIR</w:t>
+      </w:r>
+    </w:p>
+    <w:p>
+      <w:pPr>
+        <w:spacing w:before="0" w:after="0" w:line="240" w:lineRule="auto"/>
+        <w:ind w:firstLine="0" w:left="2268"/>
+        <w:jc w:val="both"/>
+      </w:pPr>
+      <w:r>
+        <w:rPr>
+          <w:rFonts w:ascii="Times New Roman" w:hAnsi="Times New Roman"/>
+          <w:b w:val="0"/>
+          <w:color w:val="000000"/>
+          <w:sz w:val="20"/>
+        </w:rPr>
+        <w:t xml:space="preserve">A contratação de empréstimo consignado por consumidor analfabeto sem observância da assinatura a rogo viola o art. 595 do Código Civil e atrai a incidência da Súmula 30 do TJPI, impondo a nulidade contratual. A relação jurídica possui natureza consumerista, incidindo o Código de Defesa do Consumidor e a responsabilidade objetiva da instituição financeira, nos termos da Súmula 297 do STJ. Nas relações de trato sucessivo decorrentes de descontos indevidos em benefício previdenciário, aplica-se a prescrição quinquenal prevista no art. 27 do CDC, preservando-se apenas a restituição das parcelas descontadas dentro do quinquênio anterior ao ajuizamento da demanda. O deslocamento do termo inicial da prescrição para o último desconto indevido esvazia o instituto prescricional e contraria a jurisprudência consolidada do Superior Tribunal de Justiça. Os descontos indevidos em benefício previdenciário decorrentes de contrato nulo configuram dano moral in re ipsa, dispensando prova específica do prejuízo extrapatrimonial. O valor da indenização por danos morais fixado em R$ 2.000,00 observa os princípios da razoabilidade e proporcionalidade, considerando a extensão do dano, o caráter alimentar do benefício atingido e a condição econômica das partes. A revisão do quantum indenizatório somente se admite quando o valor arbitrado se mostra manifestamente irrisório ou exorbitante, hipótese não configurada nos autos. A decisão agravada enfrenta adequadamente as teses devolvidas pelas partes, observando os arts. 489, § 1º, IV, e 932 do CPC e o art. 93, IX, da Constituição Federal.</w:t>
+      </w:r>
+    </w:p>
+    <w:p>
+      <w:pPr>
+        <w:spacing w:before="0" w:after="0" w:line="240" w:lineRule="auto"/>
+        <w:ind w:firstLine="0" w:left="2268"/>
+        <w:jc w:val="both"/>
+      </w:pPr>
+      <w:r>
+        <w:rPr>
+          <w:rFonts w:ascii="Times New Roman" w:hAnsi="Times New Roman"/>
+          <w:b w:val="0"/>
+          <w:color w:val="000000"/>
+          <w:sz w:val="20"/>
+        </w:rPr>
+        <w:t xml:space="preserve">IV. DISPOSITIVO E TESE</w:t>
+      </w:r>
+    </w:p>
+    <w:p>
+      <w:pPr>
+        <w:spacing w:before="0" w:after="0" w:line="240" w:lineRule="auto"/>
+        <w:ind w:firstLine="0" w:left="2268"/>
+        <w:jc w:val="both"/>
+      </w:pPr>
+      <w:r>
+        <w:rPr>
+          <w:rFonts w:ascii="Times New Roman" w:hAnsi="Times New Roman"/>
+          <w:b w:val="0"/>
+          <w:color w:val="000000"/>
+          <w:sz w:val="20"/>
+        </w:rPr>
+        <w:t xml:space="preserve">Recurso desprovido.</w:t>
+      </w:r>
+    </w:p>
+    <w:p>
+      <w:pPr>
+        <w:spacing w:before="0" w:after="0" w:line="240" w:lineRule="auto"/>
+        <w:ind w:firstLine="0" w:left="2268"/>
+        <w:jc w:val="both"/>
+      </w:pPr>
+      <w:r>
+        <w:rPr>
+          <w:rFonts w:ascii="Times New Roman" w:hAnsi="Times New Roman"/>
+          <w:b w:val="0"/>
+          <w:color w:val="000000"/>
+          <w:sz w:val="20"/>
+        </w:rPr>
+        <w:t xml:space="preserve">Tese de julgamento: A nulidade de contrato de empréstimo consignado firmado por consumidor analfabeto sem assinatura a rogo autoriza a restituição dos descontos indevidos realizados em benefício previdenciário. Nas relações de trato sucessivo decorrentes de descontos indevidos em benefício previdenciário, a prescrição quinquenal alcança apenas as parcelas anteriores aos cinco anos do ajuizamento da ação. Os descontos indevidos em benefício previdenciário decorrentes de contrato nulo configuram dano moral in re ipsa. A revisão do quantum indenizatório depende da demonstração de manifesta irrisoriedade ou exorbitância do valor arbitrado.</w:t>
+      </w:r>
+    </w:p>
+    <w:p>
+      <w:pPr>
+        <w:spacing w:before="0" w:after="0" w:line="240" w:lineRule="auto"/>
+        <w:ind w:firstLine="0" w:left="2268"/>
+        <w:jc w:val="both"/>
+      </w:pPr>
+      <w:r>
+        <w:rPr>
+          <w:rFonts w:ascii="Times New Roman" w:hAnsi="Times New Roman"/>
+          <w:b w:val="0"/>
+          <w:color w:val="000000"/>
+          <w:sz w:val="20"/>
+        </w:rPr>
+        <w:t xml:space="preserve">Dispositivos relevantes citados: CF/1988, art. 93, IX; CPC, arts. 489, § 1º, IV, e 932; CDC, art. 27; CC, art. 595; RITJPI, art. 374.</w:t>
+      </w:r>
+    </w:p>
+    <w:p>
+      <w:pPr>
+        <w:spacing w:before="0" w:after="0" w:line="240" w:lineRule="auto"/>
+        <w:ind w:firstLine="0" w:left="2268"/>
+        <w:jc w:val="both"/>
+      </w:pPr>
+      <w:r>
+        <w:rPr>
+          <w:rFonts w:ascii="Times New Roman" w:hAnsi="Times New Roman"/>
+          <w:b w:val="0"/>
+          <w:color w:val="000000"/>
+          <w:sz w:val="20"/>
+        </w:rPr>
+        <w:t xml:space="preserve">Jurisprudência relevante citada: STJ, Súmula 297; TJPI, Súmula 30; STJ, AgRg no REsp 1.296.285/RJ, Rel. Min. Napoleão Nunes Maia Filho, Primeira Turma, j. 16.06.2016, DJe 24.06.2016; STJ, REsp 1.229.322/RJ, Rel. Min. Castro Meira, DJe 02.06.2011; STJ, AgRg no AREsp 600.569/RS, Rel. Min. Olindo Menezes, DJe 20.11.2015.</w:t>
+      </w:r>
+    </w:p>
+    <w:p>
+      <w:pPr>
+        <w:spacing w:before="0" w:after="0" w:line="240" w:lineRule="auto"/>
+        <w:ind w:firstLine="0" w:left="2268"/>
+        <w:jc w:val="both"/>
+      </w:pPr>
+      <w:r>
+        <w:rPr>
+          <w:rFonts w:ascii="Times New Roman" w:hAnsi="Times New Roman"/>
+          <w:b w:val="0"/>
+          <w:color w:val="000000"/>
+          <w:sz w:val="20"/>
+        </w:rPr>
+        <w:t xml:space="preserve">(TJPI - AGRAVO INTERNO CÍVEL 0000513-14.2017.8.18.0060 - Relator: MANOEL DE SOUSA DOURADO - 2ª Câmara Especializada Cível - Data 07/07/2026)</w:t>
       </w:r>
     </w:p>
     <w:p>
@@ -547,30 +879,7 @@
           <w:color w:val="000000"/>
           <w:sz w:val="24"/>
         </w:rPr>
-        <w:t xml:space="preserve">Portanto, o negócio jurídico encontra-se perfectibilizado, na medida em que possui agentes capazes, objeto lícito determinado e forma não defesa em lei.</w:t>
-      </w:r>
-    </w:p>
-    <w:p>
-      <w:pPr>
-        <w:spacing w:before="0" w:after="0" w:line="360" w:lineRule="auto"/>
-        <w:ind w:firstLine="0" w:left="0"/>
-        <w:jc w:val="left"/>
-      </w:pPr>
-    </w:p>
-    <w:p>
-      <w:pPr>
-        <w:spacing w:before="0" w:after="0" w:line="360" w:lineRule="auto"/>
-        <w:ind w:firstLine="0" w:left="0"/>
-        <w:jc w:val="left"/>
-      </w:pPr>
-      <w:r>
-        <w:rPr>
-          <w:rFonts w:ascii="Times New Roman" w:hAnsi="Times New Roman"/>
-          <w:b/>
-          <w:color w:val="000000"/>
-          <w:sz w:val="24"/>
-        </w:rPr>
-        <w:t xml:space="preserve">Da escolaridade da parte autora</w:t>
+        <w:t xml:space="preserve">Por conseguinte, conforme esta jurisprudência de caso similar estabeleceu, também aqui se conclui que “o valor da indenização por danos morais fixado em R$ 2.000,00 observa os princípios da razoabilidade e proporcionalidade, considerando a extensão do dano, o caráter alimentar do benefício atingido e a condição econômica das partes”.</w:t>
       </w:r>
     </w:p>
     <w:p>
@@ -586,197 +895,7 @@
           <w:color w:val="000000"/>
           <w:sz w:val="24"/>
         </w:rPr>
-        <w:t xml:space="preserve">Não há nos autos perícia ou documento que demonstre o grau de instrução ou letramento da parte autora, ônus que incumbia à parte autora (art. 373, I, do Código de Processo Civil). Ora, a inversão do art. 6º, VIII, do Código de Defesa do Consumidor recai apenas sobre a existência do contrato, fato do fornecedor, e não sobre a condição pessoal de quem a alega. Ao revés, os elementos dos autos apontam em sentido contrário, na medida em que o demandante lançou assinatura de próprio punho na ficha-proposta de abertura de conta, que registra escolaridade “Ensino Fundamental” incompleto, no termo de opção à cesta de serviços e em seu documento de identidade expedido em 28/02/2019, cuja cópia instruiu a abertura da conta (Id. 95217223). O precedente do TJPI a seguir adere a esta tese:</w:t>
-      </w:r>
-    </w:p>
-    <w:p>
-      <w:pPr>
-        <w:spacing w:before="0" w:after="0" w:line="360" w:lineRule="auto"/>
-        <w:ind w:firstLine="0" w:left="0"/>
-        <w:jc w:val="left"/>
-      </w:pPr>
-    </w:p>
-    <w:p>
-      <w:pPr>
-        <w:spacing w:before="0" w:after="0" w:line="240" w:lineRule="auto"/>
-        <w:ind w:firstLine="0" w:left="2268"/>
-        <w:jc w:val="both"/>
-      </w:pPr>
-      <w:r>
-        <w:rPr>
-          <w:rFonts w:ascii="Times New Roman" w:hAnsi="Times New Roman"/>
-          <w:b w:val="0"/>
-          <w:color w:val="000000"/>
-          <w:sz w:val="20"/>
-        </w:rPr>
-        <w:t xml:space="preserve">EMENTA: PROCESSUAL CIVIL. AÇÃO DECLARATÓRIA DE NULIDADE DE RELAÇÃO JURÍDICA C/C EXIBIÇÃO DE DOCUMENTO C/C REPETIÇÃO DO INDÉBITO C/C PEDIDO DE INDENIZAÇÃO POR DANOS MORAIS. EMPRÉSTIMO CONSIGNADO. ANALFABETISMO FUNCIONAL. NÃO COMPROVADO. CONTRATO ASSINADO. FATOS CONSTITUTIVOS. ÔNUS DA PROVA. RECURSO CONHECIDO E DESPROVIDO.</w:t>
-      </w:r>
-    </w:p>
-    <w:p>
-      <w:pPr>
-        <w:spacing w:before="0" w:after="0" w:line="240" w:lineRule="auto"/>
-        <w:ind w:firstLine="0" w:left="2268"/>
-        <w:jc w:val="both"/>
-      </w:pPr>
-      <w:r>
-        <w:rPr>
-          <w:rFonts w:ascii="Times New Roman" w:hAnsi="Times New Roman"/>
-          <w:b w:val="0"/>
-          <w:color w:val="000000"/>
-          <w:sz w:val="20"/>
-        </w:rPr>
-        <w:t xml:space="preserve">I – O analfabetismo não caracteriza, por si só, vício de consentimento apto a ensejar a anulação do negócio jurídico, pois, mesmo sendo pessoa analfabeta pode ter capacidade de compreender os fatos e exprimir sua real vontade.</w:t>
-      </w:r>
-    </w:p>
-    <w:p>
-      <w:pPr>
-        <w:spacing w:before="0" w:after="0" w:line="240" w:lineRule="auto"/>
-        <w:ind w:firstLine="0" w:left="2268"/>
-        <w:jc w:val="both"/>
-      </w:pPr>
-      <w:r>
-        <w:rPr>
-          <w:rFonts w:ascii="Times New Roman" w:hAnsi="Times New Roman"/>
-          <w:b w:val="0"/>
-          <w:color w:val="000000"/>
-          <w:sz w:val="20"/>
-        </w:rPr>
-        <w:t xml:space="preserve">II – O ordenamento jurídico não veda a pessoa analfabeta de praticar atos da vida civil, como no caso de contratar um empréstimo consignado, tanto que nos arts. 3º e 4º, do CC, o analfabetismo não foi colocado como fator de incapacidade relativa, tampouco absoluta. Todavia, a validade do contrato entabulado com pessoa analfabeta, de fato, depende da observância de condições específicas, notadamente a formalização do negócio por meio de procurador a rogo e por duas testemunhas, como entabulado no art. 595, do CC.</w:t>
-      </w:r>
-    </w:p>
-    <w:p>
-      <w:pPr>
-        <w:spacing w:before="0" w:after="0" w:line="240" w:lineRule="auto"/>
-        <w:ind w:firstLine="0" w:left="2268"/>
-        <w:jc w:val="both"/>
-      </w:pPr>
-      <w:r>
-        <w:rPr>
-          <w:rFonts w:ascii="Times New Roman" w:hAnsi="Times New Roman"/>
-          <w:b w:val="0"/>
-          <w:color w:val="000000"/>
-          <w:sz w:val="20"/>
-        </w:rPr>
-        <w:t xml:space="preserve">III – No caso, o Banco/Apelado acostou aos autos o contrato, objeto da demanda, no qual se verifica que a manifestação de vontade da Apelante foi realizada por meio de sua assinatura de próprio punho (id. 4408042 – pág. 01/10).</w:t>
-      </w:r>
-    </w:p>
-    <w:p>
-      <w:pPr>
-        <w:spacing w:before="0" w:after="0" w:line="240" w:lineRule="auto"/>
-        <w:ind w:firstLine="0" w:left="2268"/>
-        <w:jc w:val="both"/>
-      </w:pPr>
-      <w:r>
-        <w:rPr>
-          <w:rFonts w:ascii="Times New Roman" w:hAnsi="Times New Roman"/>
-          <w:b w:val="0"/>
-          <w:color w:val="000000"/>
-          <w:sz w:val="20"/>
-        </w:rPr>
-        <w:t xml:space="preserve">IV – Compulsando-se os autos, observa-se que os documentos pessoais da Apelante não informam a sua condição de analfabeta, diversamente, consta a assinatura uníssona com as demais constantes em procuração (id. nº 4408035 – pág.</w:t>
-      </w:r>
-    </w:p>
-    <w:p>
-      <w:pPr>
-        <w:spacing w:before="0" w:after="0" w:line="240" w:lineRule="auto"/>
-        <w:ind w:firstLine="0" w:left="2268"/>
-        <w:jc w:val="both"/>
-      </w:pPr>
-      <w:r>
-        <w:rPr>
-          <w:rFonts w:ascii="Times New Roman" w:hAnsi="Times New Roman"/>
-          <w:b w:val="0"/>
-          <w:color w:val="000000"/>
-          <w:sz w:val="20"/>
-        </w:rPr>
-        <w:t xml:space="preserve">01) e declaração de residência (id. nº 4408042 – pág. 08), não indicando fraude. Não há nos autos comprovação da condição de analfabetismo da Apelante nos seus documentos pessoais ou qualquer prova de que ela sabe apenas desenhar o seu nome.</w:t>
-      </w:r>
-    </w:p>
-    <w:p>
-      <w:pPr>
-        <w:spacing w:before="0" w:after="0" w:line="240" w:lineRule="auto"/>
-        <w:ind w:firstLine="0" w:left="2268"/>
-        <w:jc w:val="both"/>
-      </w:pPr>
-      <w:r>
-        <w:rPr>
-          <w:rFonts w:ascii="Times New Roman" w:hAnsi="Times New Roman"/>
-          <w:b w:val="0"/>
-          <w:color w:val="000000"/>
-          <w:sz w:val="20"/>
-        </w:rPr>
-        <w:t xml:space="preserve">V – Tratando-se de fatos constitutivos, caberia a Apelante fazer prova induvidosa da sua condição de analfabeta, como preceitua o art. 373, I, do CPC, porém, não se desincumbiu do seu ônus probatório.</w:t>
-      </w:r>
-    </w:p>
-    <w:p>
-      <w:pPr>
-        <w:spacing w:before="0" w:after="0" w:line="240" w:lineRule="auto"/>
-        <w:ind w:firstLine="0" w:left="2268"/>
-        <w:jc w:val="both"/>
-      </w:pPr>
-      <w:r>
-        <w:rPr>
-          <w:rFonts w:ascii="Times New Roman" w:hAnsi="Times New Roman"/>
-          <w:b w:val="0"/>
-          <w:color w:val="000000"/>
-          <w:sz w:val="20"/>
-        </w:rPr>
-        <w:t xml:space="preserve">VI – A simples alegação de analfabetismo não basta para fundamentar eventual provimento judicial – allegatio et non probatio quase non allegatio</w:t>
-      </w:r>
-    </w:p>
-    <w:p>
-      <w:pPr>
-        <w:spacing w:before="0" w:after="0" w:line="240" w:lineRule="auto"/>
-        <w:ind w:firstLine="0" w:left="2268"/>
-        <w:jc w:val="both"/>
-      </w:pPr>
-      <w:r>
-        <w:rPr>
-          <w:rFonts w:ascii="Times New Roman" w:hAnsi="Times New Roman"/>
-          <w:b w:val="0"/>
-          <w:color w:val="000000"/>
-          <w:sz w:val="20"/>
-        </w:rPr>
-        <w:t xml:space="preserve">VII – Recurso conhecido e desprovido.</w:t>
-      </w:r>
-    </w:p>
-    <w:p>
-      <w:pPr>
-        <w:spacing w:before="0" w:after="0" w:line="240" w:lineRule="auto"/>
-        <w:ind w:firstLine="0" w:left="2268"/>
-        <w:jc w:val="both"/>
-      </w:pPr>
-      <w:r>
-        <w:rPr>
-          <w:rFonts w:ascii="Times New Roman" w:hAnsi="Times New Roman"/>
-          <w:b w:val="0"/>
-          <w:color w:val="000000"/>
-          <w:sz w:val="20"/>
-        </w:rPr>
-        <w:t xml:space="preserve">(TJPI - APELAÇÃO CÍVEL 0801981-77.2020.8.18.0026 - Relator: RAIMUNDO EUFRASIO ALVES FILHO - 1ª Câmara Especializada Cível - Data 03/04/2023)</w:t>
-      </w:r>
-    </w:p>
-    <w:p>
-      <w:pPr>
-        <w:spacing w:before="0" w:after="0" w:line="360" w:lineRule="auto"/>
-        <w:ind w:firstLine="0" w:left="0"/>
-        <w:jc w:val="left"/>
-      </w:pPr>
-    </w:p>
-    <w:p>
-      <w:pPr>
-        <w:spacing w:before="0" w:after="0" w:line="360" w:lineRule="auto"/>
-        <w:ind w:firstLine="709" w:left="0"/>
-        <w:jc w:val="both"/>
-      </w:pPr>
-      <w:r>
-        <w:rPr>
-          <w:rFonts w:ascii="Times New Roman" w:hAnsi="Times New Roman"/>
-          <w:b w:val="0"/>
-          <w:color w:val="000000"/>
-          <w:sz w:val="24"/>
-        </w:rPr>
-        <w:t xml:space="preserve">Portanto, em relação à esta questão levantada, não há defeito no negócio jurídico.</w:t>
+        <w:t xml:space="preserve">Os autos atestam, precipuamente, um prejuízo de R$ 1.962,00 (mil, novecentos e sessenta e dois reais), a ser contabilizado em liquidação.</w:t>
       </w:r>
     </w:p>
     <w:p>
@@ -822,7 +941,78 @@
           <w:color w:val="000000"/>
           <w:sz w:val="24"/>
         </w:rPr>
-        <w:t xml:space="preserve">Pelo exposto, com fundamento no art. 487, I, do CPC, JULGO IMPROCEDENTES os pedidos deduzidos na inicial. Sem custas, face à gratuidade deferida. Fixo honorários em 10% (dez por cento) do valor da causa, cuja exigibilidade fica suspensa na forma do § 3º do art. 98 do CPC.</w:t>
+        <w:t xml:space="preserve">Pelo exposto, com fundamento nos arts. 186, 595 e 927 do CC, nos arts. 6º, VIII, e 14 do CDC e nas Súmulas 30 e 37 do TJPI, c/c o art. 487, I, do CPC, JULGO PROCEDENTES os pedidos para declarar a nulidade do contrato de cesta de serviços que ampara as tarifas “CESTA B.EXPRESSO5” e “PACOTE DE SERVIÇOS PADRONIZADO PRIORITÁRIOS I”, formalizado pelo Termo de Opção à Cesta de Serviços Bradesco Expresso de 03/05/2019 (Id. 95217223) e pelo Termo de Opção à Cesta de Serviços nº 0252214080, de 05/09/2023 (Id. 95217224), e inexigível o débito dele decorrente, condenar a parte demandada a restituir em dobro os valores descontados do benefício da parte autora, cessando de imediato os descontos, e condenar a parte demandada ao pagamento de indenização por danos morais no valor de R$ 2.000,00 (dois mil reais).</w:t>
+      </w:r>
+    </w:p>
+    <w:p>
+      <w:pPr>
+        <w:spacing w:before="0" w:after="0" w:line="360" w:lineRule="auto"/>
+        <w:ind w:firstLine="709" w:left="0"/>
+        <w:jc w:val="both"/>
+      </w:pPr>
+      <w:r>
+        <w:rPr>
+          <w:rFonts w:ascii="Times New Roman" w:hAnsi="Times New Roman"/>
+          <w:b w:val="0"/>
+          <w:color w:val="000000"/>
+          <w:sz w:val="24"/>
+        </w:rPr>
+        <w:t xml:space="preserve">Sobre a indenização por danos morais incidem correção monetária pelo IPCA desde o arbitramento (Súmula 362 do STJ) e juros de mora pela taxa legal (art. 406, § 1º, do CC) desde o evento danoso (Súmula 54 do STJ).</w:t>
+      </w:r>
+    </w:p>
+    <w:p>
+      <w:pPr>
+        <w:spacing w:before="0" w:after="0" w:line="360" w:lineRule="auto"/>
+        <w:ind w:firstLine="0" w:left="0"/>
+        <w:jc w:val="left"/>
+      </w:pPr>
+    </w:p>
+    <w:p>
+      <w:pPr>
+        <w:spacing w:before="0" w:after="0" w:line="360" w:lineRule="auto"/>
+        <w:ind w:firstLine="709" w:left="0"/>
+        <w:jc w:val="both"/>
+      </w:pPr>
+      <w:r>
+        <w:rPr>
+          <w:rFonts w:ascii="Times New Roman" w:hAnsi="Times New Roman"/>
+          <w:b w:val="0"/>
+          <w:color w:val="000000"/>
+          <w:sz w:val="24"/>
+        </w:rPr>
+        <w:t xml:space="preserve">Considerando o prazo prescricional de 05 (cinco) anos do art. 27 do CDC, a restituição alcança apenas as parcelas não prescritas.</w:t>
+      </w:r>
+    </w:p>
+    <w:p>
+      <w:pPr>
+        <w:spacing w:before="0" w:after="0" w:line="360" w:lineRule="auto"/>
+        <w:ind w:firstLine="709" w:left="0"/>
+        <w:jc w:val="both"/>
+      </w:pPr>
+      <w:r>
+        <w:rPr>
+          <w:rFonts w:ascii="Times New Roman" w:hAnsi="Times New Roman"/>
+          <w:b w:val="0"/>
+          <w:color w:val="000000"/>
+          <w:sz w:val="24"/>
+        </w:rPr>
+        <w:t xml:space="preserve">O valor da restituição será acrescido de juros de mora pela taxa legal (art. 406, § 1º, do CC) desde a citação e de correção monetária pelo IPCA desde cada débito (art. 389, parágrafo único, do CC).</w:t>
+      </w:r>
+    </w:p>
+    <w:p>
+      <w:pPr>
+        <w:spacing w:before="0" w:after="0" w:line="360" w:lineRule="auto"/>
+        <w:ind w:firstLine="709" w:left="0"/>
+        <w:jc w:val="both"/>
+      </w:pPr>
+      <w:r>
+        <w:rPr>
+          <w:rFonts w:ascii="Times New Roman" w:hAnsi="Times New Roman"/>
+          <w:b w:val="0"/>
+          <w:color w:val="000000"/>
+          <w:sz w:val="24"/>
+        </w:rPr>
+        <w:t xml:space="preserve">Custas pela parte demandada. Fixo honorários em 10% (dez por cento) sobre o valor da condenação.</w:t>
       </w:r>
     </w:p>
     <w:p>
@@ -861,7 +1051,7 @@
           <w:color w:val="000000"/>
           <w:sz w:val="24"/>
         </w:rPr>
-        <w:t xml:space="preserve">Com o trânsito em julgado, arquivem-se os autos com a devida baixa.</w:t>
+        <w:t xml:space="preserve">Com o trânsito em julgado, cumprida a sentença, arquivem-se os autos com a devida baixa.</w:t>
       </w:r>
     </w:p>
     <w:p>

</xml_diff>